<commit_message>
Use module IDs everywhere, link datasheets to atekmidas.com, firmware command handling fixes
- Firmware/API/UI: module names (ATEK1801, ATEK1601, ATEK1231, ATEK1001, ATEK1202) instead of chip IDs; not-ready modules marked
- Chip ATEK888P5 renamed to ATEK888BP5 in all documents
- UI: datasheet button opens atekmidas.com module page; embedded PDFs and datasheets/ folder removed
- Firmware: command queue (no lost commands), strict SET parsing, safe USB transmit when no host is connected
- API 1.1.0 (accepts old chip IDs from older firmware), UI 2.2.0, docs revision 1.1
</commit_message>
<xml_diff>
--- a/docs/source/ATEK1601_Programming_Supplement.docx
+++ b/docs/source/ATEK1601_Programming_Supplement.docx
@@ -54,7 +54,7 @@
         <w:spacing w:after="120"/>
       </w:pPr>
       <w:r>
-        <w:t xml:space="preserve">Document revision 1.0  |  Python API version 1.0.0</w:t>
+        <w:t>Document revision 1.1  |  Python API version 1.1.0</w:t>
       </w:r>
     </w:p>
     <w:p>
@@ -80,7 +80,7 @@
         <w:spacing w:after="120"/>
       </w:pPr>
       <w:r>
-        <w:t xml:space="preserve">Software, example programs and datasheets: </w:t>
+        <w:t xml:space="preserve">Software and example programs: </w:t>
       </w:r>
       <w:hyperlink w:history="1" r:id="rIdgiotzyqstlj0zgjaoo3jo">
         <w:r>
@@ -283,7 +283,7 @@
               <w:keepLines/>
             </w:pPr>
             <w:r>
-              <w:t xml:space="preserve">RF chip (datasheet)</w:t>
+              <w:t>RF chip</w:t>
             </w:r>
           </w:p>
         </w:tc>
@@ -501,8 +501,17 @@
         <w:spacing w:after="120"/>
       </w:pPr>
       <w:r>
-        <w:t xml:space="preserve">RF performance data is found in the datasheet of the RF chip.</w:t>
-      </w:r>
+        <w:t xml:space="preserve">RF performance data is found in the module datasheet: </w:t>
+      </w:r>
+      <w:hyperlink w:history="1" r:id="rId8">
+        <w:r>
+          <w:rPr>
+            <w:color w:val="0563C1"/>
+            <w:u w:val="single"/>
+          </w:rPr>
+          <w:t xml:space="preserve">https://atekmidas.com/products/modules/atek1601/</w:t>
+        </w:r>
+      </w:hyperlink>
     </w:p>
     <w:p>
       <w:pPr>

</xml_diff>